<commit_message>
docs: embed screenshots into the demo process guide
Adds 5 figures to the walkthrough (docx + pdf):
- Fig 1: database planes in SSMS (control + per-tenant Master/FY)
- Fig 2: tenant patient records with UHIDs
- Fig 3: insurance claims with fiscal-year numbers + lifecycle status
- Fig 4: GitHub Actions CI passing green
- Fig 5: cross-database parity check (all MATCH)

Co-Authored-By: Claude Opus 4.8 (1M context) <noreply@anthropic.com>
</commit_message>
<xml_diff>
--- a/docs/Finnid_HIS_Demo_Process_Guide.docx
+++ b/docs/Finnid_HIS_Demo_Process_Guide.docx
@@ -973,6 +973,59 @@
     </w:p>
     <w:p>
       <w:pPr>
+        <w:jc w:val="center"/>
+      </w:pPr>
+      <w:r>
+        <w:drawing>
+          <wp:inline xmlns:a="http://schemas.openxmlformats.org/drawingml/2006/main" xmlns:pic="http://schemas.openxmlformats.org/drawingml/2006/picture">
+            <wp:extent cx="5760720" cy="3240405"/>
+            <wp:docPr id="1" name="Picture 1"/>
+            <wp:cNvGraphicFramePr>
+              <a:graphicFrameLocks noChangeAspect="1"/>
+            </wp:cNvGraphicFramePr>
+            <a:graphic>
+              <a:graphicData uri="http://schemas.openxmlformats.org/drawingml/2006/picture">
+                <pic:pic>
+                  <pic:nvPicPr>
+                    <pic:cNvPr id="0" name="ssms_shot4.png"/>
+                    <pic:cNvPicPr/>
+                  </pic:nvPicPr>
+                  <pic:blipFill>
+                    <a:blip r:embed="rId9"/>
+                    <a:stretch>
+                      <a:fillRect/>
+                    </a:stretch>
+                  </pic:blipFill>
+                  <pic:spPr>
+                    <a:xfrm>
+                      <a:off x="0" y="0"/>
+                      <a:ext cx="5760720" cy="3240405"/>
+                    </a:xfrm>
+                    <a:prstGeom prst="rect"/>
+                  </pic:spPr>
+                </pic:pic>
+              </a:graphicData>
+            </a:graphic>
+          </wp:inline>
+        </w:drawing>
+      </w:r>
+    </w:p>
+    <w:p>
+      <w:pPr>
+        <w:spacing w:after="240"/>
+        <w:jc w:val="center"/>
+      </w:pPr>
+      <w:r>
+        <w:rPr>
+          <w:i/>
+          <w:color w:val="555555"/>
+          <w:sz w:val="18"/>
+        </w:rPr>
+        <w:t>Fig 1.  The database planes in SQL Server — HIS_Platform (control) plus per-tenant Master and fiscal-year (FY) tables.</w:t>
+      </w:r>
+    </w:p>
+    <w:p>
+      <w:pPr>
         <w:pStyle w:val="Heading1"/>
       </w:pPr>
       <w:r>
@@ -1933,6 +1986,59 @@
     </w:p>
     <w:p>
       <w:pPr>
+        <w:jc w:val="center"/>
+      </w:pPr>
+      <w:r>
+        <w:drawing>
+          <wp:inline xmlns:a="http://schemas.openxmlformats.org/drawingml/2006/main" xmlns:pic="http://schemas.openxmlformats.org/drawingml/2006/picture">
+            <wp:extent cx="5760720" cy="3240405"/>
+            <wp:docPr id="2" name="Picture 2"/>
+            <wp:cNvGraphicFramePr>
+              <a:graphicFrameLocks noChangeAspect="1"/>
+            </wp:cNvGraphicFramePr>
+            <a:graphic>
+              <a:graphicData uri="http://schemas.openxmlformats.org/drawingml/2006/picture">
+                <pic:pic>
+                  <pic:nvPicPr>
+                    <pic:cNvPr id="0" name="rbk_shot2.png"/>
+                    <pic:cNvPicPr/>
+                  </pic:nvPicPr>
+                  <pic:blipFill>
+                    <a:blip r:embed="rId10"/>
+                    <a:stretch>
+                      <a:fillRect/>
+                    </a:stretch>
+                  </pic:blipFill>
+                  <pic:spPr>
+                    <a:xfrm>
+                      <a:off x="0" y="0"/>
+                      <a:ext cx="5760720" cy="3240405"/>
+                    </a:xfrm>
+                    <a:prstGeom prst="rect"/>
+                  </pic:spPr>
+                </pic:pic>
+              </a:graphicData>
+            </a:graphic>
+          </wp:inline>
+        </w:drawing>
+      </w:r>
+    </w:p>
+    <w:p>
+      <w:pPr>
+        <w:spacing w:after="240"/>
+        <w:jc w:val="center"/>
+      </w:pPr>
+      <w:r>
+        <w:rPr>
+          <w:i/>
+          <w:color w:val="555555"/>
+          <w:sz w:val="18"/>
+        </w:rPr>
+        <w:t>Fig 2.  Patient records inside a tenant database — each with a system-issued UHID (e.g. BR1-2026-…).</w:t>
+      </w:r>
+    </w:p>
+    <w:p>
+      <w:pPr>
         <w:pStyle w:val="Heading2"/>
       </w:pPr>
       <w:r>
@@ -2225,6 +2331,59 @@
       </w:pPr>
       <w:r>
         <w:t>PM-JAY (BIS verify + HBP-rate TMS claim), ESIC / CGHS verification — same claim engine.</w:t>
+      </w:r>
+    </w:p>
+    <w:p>
+      <w:pPr>
+        <w:jc w:val="center"/>
+      </w:pPr>
+      <w:r>
+        <w:drawing>
+          <wp:inline xmlns:a="http://schemas.openxmlformats.org/drawingml/2006/main" xmlns:pic="http://schemas.openxmlformats.org/drawingml/2006/picture">
+            <wp:extent cx="5760720" cy="3056073"/>
+            <wp:docPr id="3" name="Picture 3"/>
+            <wp:cNvGraphicFramePr>
+              <a:graphicFrameLocks noChangeAspect="1"/>
+            </wp:cNvGraphicFramePr>
+            <a:graphic>
+              <a:graphicData uri="http://schemas.openxmlformats.org/drawingml/2006/picture">
+                <pic:pic>
+                  <pic:nvPicPr>
+                    <pic:cNvPr id="0" name="rbk_claims.png"/>
+                    <pic:cNvPicPr/>
+                  </pic:nvPicPr>
+                  <pic:blipFill>
+                    <a:blip r:embed="rId11"/>
+                    <a:stretch>
+                      <a:fillRect/>
+                    </a:stretch>
+                  </pic:blipFill>
+                  <pic:spPr>
+                    <a:xfrm>
+                      <a:off x="0" y="0"/>
+                      <a:ext cx="5760720" cy="3056073"/>
+                    </a:xfrm>
+                    <a:prstGeom prst="rect"/>
+                  </pic:spPr>
+                </pic:pic>
+              </a:graphicData>
+            </a:graphic>
+          </wp:inline>
+        </w:drawing>
+      </w:r>
+    </w:p>
+    <w:p>
+      <w:pPr>
+        <w:spacing w:after="240"/>
+        <w:jc w:val="center"/>
+      </w:pPr>
+      <w:r>
+        <w:rPr>
+          <w:i/>
+          <w:color w:val="555555"/>
+          <w:sz w:val="18"/>
+        </w:rPr>
+        <w:t>Fig 3.  Insurance claims with fiscal-year claim numbers (CL-FY2026-27-…), channel (TPA/TMS), amounts and lifecycle status.</w:t>
       </w:r>
     </w:p>
     <w:p>
@@ -3529,6 +3688,112 @@
     </w:p>
     <w:p>
       <w:pPr>
+        <w:jc w:val="center"/>
+      </w:pPr>
+      <w:r>
+        <w:drawing>
+          <wp:inline xmlns:a="http://schemas.openxmlformats.org/drawingml/2006/main" xmlns:pic="http://schemas.openxmlformats.org/drawingml/2006/picture">
+            <wp:extent cx="5760720" cy="3240405"/>
+            <wp:docPr id="4" name="Picture 4"/>
+            <wp:cNvGraphicFramePr>
+              <a:graphicFrameLocks noChangeAspect="1"/>
+            </wp:cNvGraphicFramePr>
+            <a:graphic>
+              <a:graphicData uri="http://schemas.openxmlformats.org/drawingml/2006/picture">
+                <pic:pic>
+                  <pic:nvPicPr>
+                    <pic:cNvPr id="0" name="actions_browser.png"/>
+                    <pic:cNvPicPr/>
+                  </pic:nvPicPr>
+                  <pic:blipFill>
+                    <a:blip r:embed="rId12"/>
+                    <a:stretch>
+                      <a:fillRect/>
+                    </a:stretch>
+                  </pic:blipFill>
+                  <pic:spPr>
+                    <a:xfrm>
+                      <a:off x="0" y="0"/>
+                      <a:ext cx="5760720" cy="3240405"/>
+                    </a:xfrm>
+                    <a:prstGeom prst="rect"/>
+                  </pic:spPr>
+                </pic:pic>
+              </a:graphicData>
+            </a:graphic>
+          </wp:inline>
+        </w:drawing>
+      </w:r>
+    </w:p>
+    <w:p>
+      <w:pPr>
+        <w:spacing w:after="240"/>
+        <w:jc w:val="center"/>
+      </w:pPr>
+      <w:r>
+        <w:rPr>
+          <w:i/>
+          <w:color w:val="555555"/>
+          <w:sz w:val="18"/>
+        </w:rPr>
+        <w:t>Fig 4.  GitHub Actions — the CI pipeline (build + functional smoke) passing green on the latest commit.</w:t>
+      </w:r>
+    </w:p>
+    <w:p>
+      <w:pPr>
+        <w:jc w:val="center"/>
+      </w:pPr>
+      <w:r>
+        <w:drawing>
+          <wp:inline xmlns:a="http://schemas.openxmlformats.org/drawingml/2006/main" xmlns:pic="http://schemas.openxmlformats.org/drawingml/2006/picture">
+            <wp:extent cx="5760720" cy="3056073"/>
+            <wp:docPr id="5" name="Picture 5"/>
+            <wp:cNvGraphicFramePr>
+              <a:graphicFrameLocks noChangeAspect="1"/>
+            </wp:cNvGraphicFramePr>
+            <a:graphic>
+              <a:graphicData uri="http://schemas.openxmlformats.org/drawingml/2006/picture">
+                <pic:pic>
+                  <pic:nvPicPr>
+                    <pic:cNvPr id="0" name="excel_grid.png"/>
+                    <pic:cNvPicPr/>
+                  </pic:nvPicPr>
+                  <pic:blipFill>
+                    <a:blip r:embed="rId13"/>
+                    <a:stretch>
+                      <a:fillRect/>
+                    </a:stretch>
+                  </pic:blipFill>
+                  <pic:spPr>
+                    <a:xfrm>
+                      <a:off x="0" y="0"/>
+                      <a:ext cx="5760720" cy="3056073"/>
+                    </a:xfrm>
+                    <a:prstGeom prst="rect"/>
+                  </pic:spPr>
+                </pic:pic>
+              </a:graphicData>
+            </a:graphic>
+          </wp:inline>
+        </w:drawing>
+      </w:r>
+    </w:p>
+    <w:p>
+      <w:pPr>
+        <w:spacing w:after="240"/>
+        <w:jc w:val="center"/>
+      </w:pPr>
+      <w:r>
+        <w:rPr>
+          <w:i/>
+          <w:color w:val="555555"/>
+          <w:sz w:val="18"/>
+        </w:rPr>
+        <w:t>Fig 5.  Cross-database parity check — module row-counts identical across the fiscal-year databases (all MATCH).</w:t>
+      </w:r>
+    </w:p>
+    <w:p>
+      <w:pPr>
         <w:pStyle w:val="Heading1"/>
       </w:pPr>
       <w:r>

</xml_diff>